<commit_message>
fix: updated images and video in the use-guide
</commit_message>
<xml_diff>
--- a/docs/Guia-de-uso-Windows.docx
+++ b/docs/Guia-de-uso-Windows.docx
@@ -163,12 +163,6 @@
         <w:gridCol w:w="3960"/>
       </w:tblGrid>
       <w:tr>
-        <w:tblPrEx>
-          <w:tblCellMar>
-            <w:top w:w="0" w:type="dxa"/>
-            <w:bottom w:w="0" w:type="dxa"/>
-          </w:tblCellMar>
-        </w:tblPrEx>
         <w:trPr>
           <w:tblHeader/>
         </w:trPr>
@@ -255,12 +249,6 @@
         </w:tc>
       </w:tr>
       <w:tr>
-        <w:tblPrEx>
-          <w:tblCellMar>
-            <w:top w:w="0" w:type="dxa"/>
-            <w:bottom w:w="0" w:type="dxa"/>
-          </w:tblCellMar>
-        </w:tblPrEx>
         <w:tc>
           <w:tcPr>
             <w:tcW w:w="2200" w:type="dxa"/>
@@ -918,12 +906,6 @@
         <w:gridCol w:w="6360"/>
       </w:tblGrid>
       <w:tr>
-        <w:tblPrEx>
-          <w:tblCellMar>
-            <w:top w:w="0" w:type="dxa"/>
-            <w:bottom w:w="0" w:type="dxa"/>
-          </w:tblCellMar>
-        </w:tblPrEx>
         <w:trPr>
           <w:tblHeader/>
         </w:trPr>
@@ -983,12 +965,6 @@
         </w:tc>
       </w:tr>
       <w:tr>
-        <w:tblPrEx>
-          <w:tblCellMar>
-            <w:top w:w="0" w:type="dxa"/>
-            <w:bottom w:w="0" w:type="dxa"/>
-          </w:tblCellMar>
-        </w:tblPrEx>
         <w:tc>
           <w:tcPr>
             <w:tcW w:w="3000" w:type="dxa"/>
@@ -1299,10 +1275,10 @@
       </w:pPr>
       <w:r>
         <w:drawing>
-          <wp:inline distT="0" distB="0" distL="0" distR="0" wp14:anchorId="237C07E5" wp14:editId="5C4E5E53">
-            <wp:extent cx="5943600" cy="3339465"/>
-            <wp:effectExtent l="0" t="0" r="0" b="635"/>
-            <wp:docPr id="1637144955" name="Imagen 1"/>
+          <wp:inline distT="0" distB="0" distL="0" distR="0" wp14:anchorId="38392F63" wp14:editId="43B2358A">
+            <wp:extent cx="5815584" cy="3267538"/>
+            <wp:effectExtent l="0" t="0" r="1270" b="0"/>
+            <wp:docPr id="2047158841" name="Imagen 1"/>
             <wp:cNvGraphicFramePr>
               <a:graphicFrameLocks xmlns:a="http://schemas.openxmlformats.org/drawingml/2006/main" noChangeAspect="1"/>
             </wp:cNvGraphicFramePr>
@@ -1310,7 +1286,7 @@
               <a:graphicData uri="http://schemas.openxmlformats.org/drawingml/2006/picture">
                 <pic:pic xmlns:pic="http://schemas.openxmlformats.org/drawingml/2006/picture">
                   <pic:nvPicPr>
-                    <pic:cNvPr id="1637144955" name=""/>
+                    <pic:cNvPr id="2047158841" name=""/>
                     <pic:cNvPicPr/>
                   </pic:nvPicPr>
                   <pic:blipFill>
@@ -1322,7 +1298,7 @@
                   <pic:spPr>
                     <a:xfrm>
                       <a:off x="0" y="0"/>
-                      <a:ext cx="5943600" cy="3339465"/>
+                      <a:ext cx="5825583" cy="3273156"/>
                     </a:xfrm>
                     <a:prstGeom prst="rect">
                       <a:avLst/>
@@ -1335,8 +1311,21 @@
         </w:drawing>
       </w:r>
     </w:p>
+    <w:p>
+      <w:pPr>
+        <w:spacing w:before="100" w:after="60"/>
+        <w:jc w:val="center"/>
+      </w:pPr>
+    </w:p>
+    <w:p>
+      <w:pPr>
+        <w:spacing w:before="100" w:after="60"/>
+        <w:jc w:val="center"/>
+      </w:pPr>
+    </w:p>
     <w:tbl>
       <w:tblPr>
+        <w:tblpPr w:leftFromText="141" w:rightFromText="141" w:horzAnchor="margin" w:tblpY="-380"/>
         <w:tblW w:w="9360" w:type="dxa"/>
         <w:tblBorders>
           <w:top w:val="single" w:sz="4" w:space="0" w:color="C9D6E3"/>
@@ -1357,12 +1346,6 @@
         <w:gridCol w:w="6160"/>
       </w:tblGrid>
       <w:tr>
-        <w:tblPrEx>
-          <w:tblCellMar>
-            <w:top w:w="0" w:type="dxa"/>
-            <w:bottom w:w="0" w:type="dxa"/>
-          </w:tblCellMar>
-        </w:tblPrEx>
         <w:trPr>
           <w:tblHeader/>
         </w:trPr>
@@ -1389,6 +1372,7 @@
                 <w:sz w:val="21"/>
                 <w:szCs w:val="21"/>
               </w:rPr>
+              <w:lastRenderedPageBreak/>
               <w:t>Botón</w:t>
             </w:r>
           </w:p>
@@ -1422,12 +1406,6 @@
         </w:tc>
       </w:tr>
       <w:tr>
-        <w:tblPrEx>
-          <w:tblCellMar>
-            <w:top w:w="0" w:type="dxa"/>
-            <w:bottom w:w="0" w:type="dxa"/>
-          </w:tblCellMar>
-        </w:tblPrEx>
         <w:tc>
           <w:tcPr>
             <w:tcW w:w="3200" w:type="dxa"/>
@@ -1476,12 +1454,6 @@
         </w:tc>
       </w:tr>
       <w:tr>
-        <w:tblPrEx>
-          <w:tblCellMar>
-            <w:top w:w="0" w:type="dxa"/>
-            <w:bottom w:w="0" w:type="dxa"/>
-          </w:tblCellMar>
-        </w:tblPrEx>
         <w:tc>
           <w:tcPr>
             <w:tcW w:w="3200" w:type="dxa"/>
@@ -1502,7 +1474,6 @@
                 <w:sz w:val="21"/>
                 <w:szCs w:val="21"/>
               </w:rPr>
-              <w:lastRenderedPageBreak/>
               <w:t>Limpiar</w:t>
             </w:r>
           </w:p>
@@ -1533,12 +1504,6 @@
         </w:tc>
       </w:tr>
       <w:tr>
-        <w:tblPrEx>
-          <w:tblCellMar>
-            <w:top w:w="0" w:type="dxa"/>
-            <w:bottom w:w="0" w:type="dxa"/>
-          </w:tblCellMar>
-        </w:tblPrEx>
         <w:tc>
           <w:tcPr>
             <w:tcW w:w="3200" w:type="dxa"/>
@@ -1603,12 +1568,6 @@
         </w:tc>
       </w:tr>
       <w:tr>
-        <w:tblPrEx>
-          <w:tblCellMar>
-            <w:top w:w="0" w:type="dxa"/>
-            <w:bottom w:w="0" w:type="dxa"/>
-          </w:tblCellMar>
-        </w:tblPrEx>
         <w:tc>
           <w:tcPr>
             <w:tcW w:w="3200" w:type="dxa"/>
@@ -1659,12 +1618,6 @@
         </w:tc>
       </w:tr>
       <w:tr>
-        <w:tblPrEx>
-          <w:tblCellMar>
-            <w:top w:w="0" w:type="dxa"/>
-            <w:bottom w:w="0" w:type="dxa"/>
-          </w:tblCellMar>
-        </w:tblPrEx>
         <w:tc>
           <w:tcPr>
             <w:tcW w:w="3200" w:type="dxa"/>
@@ -1713,12 +1666,6 @@
         </w:tc>
       </w:tr>
       <w:tr>
-        <w:tblPrEx>
-          <w:tblCellMar>
-            <w:top w:w="0" w:type="dxa"/>
-            <w:bottom w:w="0" w:type="dxa"/>
-          </w:tblCellMar>
-        </w:tblPrEx>
         <w:tc>
           <w:tcPr>
             <w:tcW w:w="3200" w:type="dxa"/>
@@ -1798,13 +1745,8 @@
         <w:t>cualquier zona que no sea un botón</w:t>
       </w:r>
       <w:r>
-        <w:t xml:space="preserve"> para colocarla donde </w:t>
-      </w:r>
-      <w:proofErr w:type="spellStart"/>
-      <w:r>
-        <w:t>quieras.</w:t>
-      </w:r>
-      <w:proofErr w:type="spellEnd"/>
+        <w:t xml:space="preserve"> para colocarla donde quieras.</w:t>
+      </w:r>
     </w:p>
     <w:p>
       <w:pPr>
@@ -1983,8 +1925,6 @@
     <w:p>
       <w:pPr>
         <w:spacing w:after="100" w:line="276" w:lineRule="auto"/>
-      </w:pPr>
-      <w:r>
         <w:rPr>
           <w:b/>
           <w:bCs/>
@@ -1992,8 +1932,7 @@
           <w:sz w:val="30"/>
           <w:szCs w:val="30"/>
         </w:rPr>
-        <w:t xml:space="preserve">Video Tutorial </w:t>
-      </w:r>
+      </w:pPr>
       <w:r>
         <w:rPr>
           <w:b/>
@@ -2002,21 +1941,33 @@
           <w:sz w:val="30"/>
           <w:szCs w:val="30"/>
         </w:rPr>
-        <w:t>–</w:t>
-      </w:r>
-      <w:r>
-        <w:rPr>
-          <w:b/>
-          <w:bCs/>
-          <w:color w:val="1F4E79"/>
-          <w:sz w:val="30"/>
-          <w:szCs w:val="30"/>
-        </w:rPr>
-        <w:t xml:space="preserve"> </w:t>
-      </w:r>
-      <w:r>
-        <w:t>link</w:t>
-      </w:r>
+        <w:t>Video Tutorial</w:t>
+      </w:r>
+    </w:p>
+    <w:p>
+      <w:pPr>
+        <w:spacing w:after="100" w:line="276" w:lineRule="auto"/>
+      </w:pPr>
+      <w:hyperlink r:id="rId9" w:history="1">
+        <w:r>
+          <w:rPr>
+            <w:rStyle w:val="Hipervnculo"/>
+          </w:rPr>
+          <w:t>https://youtu.be/3x96mukz</w:t>
+        </w:r>
+        <w:r>
+          <w:rPr>
+            <w:rStyle w:val="Hipervnculo"/>
+          </w:rPr>
+          <w:t>A</w:t>
+        </w:r>
+        <w:r>
+          <w:rPr>
+            <w:rStyle w:val="Hipervnculo"/>
+          </w:rPr>
+          <w:t>jk</w:t>
+        </w:r>
+      </w:hyperlink>
     </w:p>
     <w:p>
       <w:pPr>
@@ -2055,12 +2006,6 @@
         <w:gridCol w:w="5960"/>
       </w:tblGrid>
       <w:tr>
-        <w:tblPrEx>
-          <w:tblCellMar>
-            <w:top w:w="0" w:type="dxa"/>
-            <w:bottom w:w="0" w:type="dxa"/>
-          </w:tblCellMar>
-        </w:tblPrEx>
         <w:trPr>
           <w:tblHeader/>
         </w:trPr>
@@ -2120,12 +2065,6 @@
         </w:tc>
       </w:tr>
       <w:tr>
-        <w:tblPrEx>
-          <w:tblCellMar>
-            <w:top w:w="0" w:type="dxa"/>
-            <w:bottom w:w="0" w:type="dxa"/>
-          </w:tblCellMar>
-        </w:tblPrEx>
         <w:tc>
           <w:tcPr>
             <w:tcW w:w="3400" w:type="dxa"/>
@@ -2174,12 +2113,6 @@
         </w:tc>
       </w:tr>
       <w:tr>
-        <w:tblPrEx>
-          <w:tblCellMar>
-            <w:top w:w="0" w:type="dxa"/>
-            <w:bottom w:w="0" w:type="dxa"/>
-          </w:tblCellMar>
-        </w:tblPrEx>
         <w:tc>
           <w:tcPr>
             <w:tcW w:w="3400" w:type="dxa"/>
@@ -2230,12 +2163,6 @@
         </w:tc>
       </w:tr>
       <w:tr>
-        <w:tblPrEx>
-          <w:tblCellMar>
-            <w:top w:w="0" w:type="dxa"/>
-            <w:bottom w:w="0" w:type="dxa"/>
-          </w:tblCellMar>
-        </w:tblPrEx>
         <w:tc>
           <w:tcPr>
             <w:tcW w:w="3400" w:type="dxa"/>
@@ -2284,12 +2211,6 @@
         </w:tc>
       </w:tr>
       <w:tr>
-        <w:tblPrEx>
-          <w:tblCellMar>
-            <w:top w:w="0" w:type="dxa"/>
-            <w:bottom w:w="0" w:type="dxa"/>
-          </w:tblCellMar>
-        </w:tblPrEx>
         <w:tc>
           <w:tcPr>
             <w:tcW w:w="3400" w:type="dxa"/>
@@ -3380,6 +3301,30 @@
       <w:szCs w:val="20"/>
     </w:rPr>
   </w:style>
+  <w:style w:type="character" w:styleId="Mencinsinresolver">
+    <w:name w:val="Unresolved Mention"/>
+    <w:basedOn w:val="Fuentedeprrafopredeter"/>
+    <w:uiPriority w:val="99"/>
+    <w:semiHidden/>
+    <w:unhideWhenUsed/>
+    <w:rsid w:val="00227BD7"/>
+    <w:rPr>
+      <w:color w:val="605E5C"/>
+      <w:shd w:val="clear" w:color="auto" w:fill="E1DFDD"/>
+    </w:rPr>
+  </w:style>
+  <w:style w:type="character" w:styleId="Hipervnculovisitado">
+    <w:name w:val="FollowedHyperlink"/>
+    <w:basedOn w:val="Fuentedeprrafopredeter"/>
+    <w:uiPriority w:val="99"/>
+    <w:semiHidden/>
+    <w:unhideWhenUsed/>
+    <w:rsid w:val="00227BD7"/>
+    <w:rPr>
+      <w:color w:val="96607D" w:themeColor="followedHyperlink"/>
+      <w:u w:val="single"/>
+    </w:rPr>
+  </w:style>
 </w:styles>
 </file>
 

</xml_diff>